<commit_message>
Word - Kit Retiro
</commit_message>
<xml_diff>
--- a/webapp/pdf/Kit_Retiro.docx
+++ b/webapp/pdf/Kit_Retiro.docx
@@ -46,7 +46,7 @@
           <w:sz w:val="22"/>
           <w:szCs w:val="22"/>
         </w:rPr>
-        <w:t xml:space="preserve">]] </w:t>
+        <w:t>]]</w:t>
       </w:r>
     </w:p>
     <w:p>
@@ -148,7 +148,7 @@
           <w:sz w:val="22"/>
           <w:szCs w:val="22"/>
         </w:rPr>
-        <w:t xml:space="preserve">]] </w:t>
+        <w:t>]]</w:t>
       </w:r>
     </w:p>
     <w:p>
@@ -802,7 +802,7 @@
           <w:sz w:val="22"/>
           <w:szCs w:val="22"/>
         </w:rPr>
-        <w:t xml:space="preserve">]] </w:t>
+        <w:t>]]</w:t>
       </w:r>
     </w:p>
     <w:p>
@@ -904,7 +904,7 @@
           <w:sz w:val="22"/>
           <w:szCs w:val="22"/>
         </w:rPr>
-        <w:t xml:space="preserve">]] </w:t>
+        <w:t>]]</w:t>
       </w:r>
     </w:p>
     <w:p>
@@ -1239,7 +1239,13 @@
         <w:rPr>
           <w:rFonts w:ascii="Barlow" w:eastAsia="Barlow" w:hAnsi="Barlow" w:cs="Barlow"/>
         </w:rPr>
-        <w:t>Ciudad de Residencia:</w:t>
+        <w:t>Ciudad de Residencia</w:t>
+      </w:r>
+      <w:r>
+        <w:rPr>
+          <w:rFonts w:ascii="Barlow" w:eastAsia="Barlow" w:hAnsi="Barlow" w:cs="Barlow"/>
+        </w:rPr>
+        <w:t xml:space="preserve">: </w:t>
       </w:r>
       <w:r>
         <w:rPr>
@@ -1252,195 +1258,200 @@
           <w:rFonts w:ascii="Barlow" w:eastAsia="Barlow" w:hAnsi="Barlow" w:cs="Barlow"/>
         </w:rPr>
         <w:tab/>
+      </w:r>
+      <w:r>
+        <w:rPr>
+          <w:rFonts w:ascii="Barlow" w:eastAsia="Barlow" w:hAnsi="Barlow" w:cs="Barlow"/>
+        </w:rPr>
+        <w:tab/>
+      </w:r>
+      <w:r>
+        <w:rPr>
+          <w:rFonts w:ascii="Barlow" w:eastAsia="Barlow" w:hAnsi="Barlow" w:cs="Barlow"/>
+          <w:sz w:val="22"/>
+          <w:szCs w:val="22"/>
+        </w:rPr>
+        <w:t>[[</w:t>
+      </w:r>
+      <w:proofErr w:type="spellStart"/>
+      <w:r>
+        <w:rPr>
+          <w:rFonts w:ascii="Barlow" w:eastAsia="Barlow" w:hAnsi="Barlow" w:cs="Barlow"/>
+          <w:sz w:val="22"/>
+          <w:szCs w:val="22"/>
+        </w:rPr>
+        <w:t>CiudadWork</w:t>
+      </w:r>
+      <w:proofErr w:type="spellEnd"/>
+      <w:r>
+        <w:rPr>
+          <w:rFonts w:ascii="Barlow" w:eastAsia="Barlow" w:hAnsi="Barlow" w:cs="Barlow"/>
+          <w:sz w:val="22"/>
+          <w:szCs w:val="22"/>
+        </w:rPr>
+        <w:t>]]</w:t>
+      </w:r>
+    </w:p>
+    <w:p>
+      <w:pPr>
+        <w:ind w:left="720"/>
+        <w:jc w:val="both"/>
+        <w:rPr>
+          <w:rFonts w:ascii="Barlow" w:eastAsia="Barlow" w:hAnsi="Barlow" w:cs="Barlow"/>
+        </w:rPr>
+      </w:pPr>
+    </w:p>
+    <w:p>
+      <w:pPr>
+        <w:ind w:left="720"/>
+        <w:jc w:val="both"/>
+        <w:rPr>
+          <w:rFonts w:ascii="Barlow" w:eastAsia="Barlow" w:hAnsi="Barlow" w:cs="Barlow"/>
+        </w:rPr>
+      </w:pPr>
+      <w:r>
+        <w:rPr>
+          <w:rFonts w:ascii="Barlow" w:eastAsia="Barlow" w:hAnsi="Barlow" w:cs="Barlow"/>
+        </w:rPr>
+        <w:t xml:space="preserve">Dirección (incluir el barrio/sector):       </w:t>
+      </w:r>
+      <w:r>
+        <w:rPr>
+          <w:rFonts w:ascii="Barlow" w:eastAsia="Barlow" w:hAnsi="Barlow" w:cs="Barlow"/>
+        </w:rPr>
+        <w:tab/>
+      </w:r>
+      <w:r>
+        <w:rPr>
+          <w:rFonts w:ascii="Barlow" w:eastAsia="Barlow" w:hAnsi="Barlow" w:cs="Barlow"/>
+          <w:sz w:val="22"/>
+          <w:szCs w:val="22"/>
+        </w:rPr>
+        <w:t>[[</w:t>
+      </w:r>
+      <w:proofErr w:type="spellStart"/>
+      <w:r>
+        <w:rPr>
+          <w:rFonts w:ascii="Barlow" w:eastAsia="Barlow" w:hAnsi="Barlow" w:cs="Barlow"/>
+          <w:sz w:val="22"/>
+          <w:szCs w:val="22"/>
+        </w:rPr>
+        <w:t>Direccion</w:t>
+      </w:r>
+      <w:proofErr w:type="spellEnd"/>
+      <w:r>
+        <w:rPr>
+          <w:rFonts w:ascii="Barlow" w:eastAsia="Barlow" w:hAnsi="Barlow" w:cs="Barlow"/>
+          <w:sz w:val="22"/>
+          <w:szCs w:val="22"/>
+        </w:rPr>
+        <w:t>]]</w:t>
+      </w:r>
+    </w:p>
+    <w:p>
+      <w:pPr>
+        <w:ind w:left="720"/>
+        <w:jc w:val="both"/>
+        <w:rPr>
+          <w:rFonts w:ascii="Barlow" w:eastAsia="Barlow" w:hAnsi="Barlow" w:cs="Barlow"/>
+        </w:rPr>
+      </w:pPr>
+    </w:p>
+    <w:p>
+      <w:pPr>
+        <w:ind w:firstLine="720"/>
+        <w:jc w:val="both"/>
+        <w:rPr>
+          <w:rFonts w:ascii="Barlow" w:eastAsia="Barlow" w:hAnsi="Barlow" w:cs="Barlow"/>
+          <w:sz w:val="22"/>
+          <w:szCs w:val="22"/>
+        </w:rPr>
+      </w:pPr>
+      <w:r>
+        <w:rPr>
+          <w:rFonts w:ascii="Barlow" w:eastAsia="Barlow" w:hAnsi="Barlow" w:cs="Barlow"/>
+        </w:rPr>
+        <w:t xml:space="preserve">Teléfono: </w:t>
+      </w:r>
+      <w:r>
+        <w:rPr>
+          <w:rFonts w:ascii="Barlow" w:eastAsia="Barlow" w:hAnsi="Barlow" w:cs="Barlow"/>
+        </w:rPr>
+        <w:tab/>
+      </w:r>
+      <w:r>
+        <w:rPr>
+          <w:rFonts w:ascii="Barlow" w:eastAsia="Barlow" w:hAnsi="Barlow" w:cs="Barlow"/>
+        </w:rPr>
+        <w:tab/>
+      </w:r>
+      <w:r>
+        <w:rPr>
+          <w:rFonts w:ascii="Barlow" w:eastAsia="Barlow" w:hAnsi="Barlow" w:cs="Barlow"/>
+        </w:rPr>
+        <w:tab/>
+      </w:r>
+      <w:r>
+        <w:rPr>
+          <w:rFonts w:ascii="Barlow" w:eastAsia="Barlow" w:hAnsi="Barlow" w:cs="Barlow"/>
+        </w:rPr>
+        <w:tab/>
+      </w:r>
+      <w:r>
+        <w:rPr>
+          <w:rFonts w:ascii="Barlow" w:eastAsia="Barlow" w:hAnsi="Barlow" w:cs="Barlow"/>
+          <w:sz w:val="22"/>
+          <w:szCs w:val="22"/>
+        </w:rPr>
+        <w:t>[[</w:t>
+      </w:r>
+      <w:proofErr w:type="spellStart"/>
+      <w:r>
+        <w:rPr>
+          <w:rFonts w:ascii="Barlow" w:eastAsia="Barlow" w:hAnsi="Barlow" w:cs="Barlow"/>
+          <w:sz w:val="22"/>
+          <w:szCs w:val="22"/>
+        </w:rPr>
+        <w:t>Telefono</w:t>
+      </w:r>
+      <w:proofErr w:type="spellEnd"/>
+      <w:r>
+        <w:rPr>
+          <w:rFonts w:ascii="Barlow" w:eastAsia="Barlow" w:hAnsi="Barlow" w:cs="Barlow"/>
+          <w:sz w:val="22"/>
+          <w:szCs w:val="22"/>
+        </w:rPr>
+        <w:t>]]</w:t>
+      </w:r>
+    </w:p>
+    <w:p>
+      <w:pPr>
+        <w:ind w:firstLine="720"/>
+        <w:jc w:val="both"/>
+        <w:rPr>
+          <w:rFonts w:ascii="Barlow" w:eastAsia="Barlow" w:hAnsi="Barlow" w:cs="Barlow"/>
+        </w:rPr>
+      </w:pPr>
+    </w:p>
+    <w:p>
+      <w:pPr>
+        <w:ind w:left="720"/>
+        <w:jc w:val="both"/>
+        <w:rPr>
+          <w:rFonts w:ascii="Barlow" w:eastAsia="Barlow" w:hAnsi="Barlow" w:cs="Barlow"/>
+        </w:rPr>
+      </w:pPr>
+      <w:r>
+        <w:rPr>
+          <w:rFonts w:ascii="Barlow" w:eastAsia="Barlow" w:hAnsi="Barlow" w:cs="Barlow"/>
+        </w:rPr>
+        <w:t>Correo Electrónico:</w:t>
+      </w:r>
+      <w:r>
+        <w:rPr>
+          <w:rFonts w:ascii="Barlow" w:eastAsia="Barlow" w:hAnsi="Barlow" w:cs="Barlow"/>
+        </w:rPr>
         <w:t xml:space="preserve"> </w:t>
-      </w:r>
-      <w:r>
-        <w:rPr>
-          <w:rFonts w:ascii="Barlow" w:eastAsia="Barlow" w:hAnsi="Barlow" w:cs="Barlow"/>
-        </w:rPr>
-        <w:tab/>
-      </w:r>
-      <w:r>
-        <w:rPr>
-          <w:rFonts w:ascii="Barlow" w:eastAsia="Barlow" w:hAnsi="Barlow" w:cs="Barlow"/>
-          <w:sz w:val="22"/>
-          <w:szCs w:val="22"/>
-        </w:rPr>
-        <w:t>[[</w:t>
-      </w:r>
-      <w:proofErr w:type="spellStart"/>
-      <w:r>
-        <w:rPr>
-          <w:rFonts w:ascii="Barlow" w:eastAsia="Barlow" w:hAnsi="Barlow" w:cs="Barlow"/>
-          <w:sz w:val="22"/>
-          <w:szCs w:val="22"/>
-        </w:rPr>
-        <w:t>CiudadWork</w:t>
-      </w:r>
-      <w:proofErr w:type="spellEnd"/>
-      <w:r>
-        <w:rPr>
-          <w:rFonts w:ascii="Barlow" w:eastAsia="Barlow" w:hAnsi="Barlow" w:cs="Barlow"/>
-          <w:sz w:val="22"/>
-          <w:szCs w:val="22"/>
-        </w:rPr>
-        <w:t>]]</w:t>
-      </w:r>
-    </w:p>
-    <w:p>
-      <w:pPr>
-        <w:ind w:left="720"/>
-        <w:jc w:val="both"/>
-        <w:rPr>
-          <w:rFonts w:ascii="Barlow" w:eastAsia="Barlow" w:hAnsi="Barlow" w:cs="Barlow"/>
-        </w:rPr>
-      </w:pPr>
-    </w:p>
-    <w:p>
-      <w:pPr>
-        <w:ind w:left="720"/>
-        <w:jc w:val="both"/>
-        <w:rPr>
-          <w:rFonts w:ascii="Barlow" w:eastAsia="Barlow" w:hAnsi="Barlow" w:cs="Barlow"/>
-        </w:rPr>
-      </w:pPr>
-      <w:r>
-        <w:rPr>
-          <w:rFonts w:ascii="Barlow" w:eastAsia="Barlow" w:hAnsi="Barlow" w:cs="Barlow"/>
-        </w:rPr>
-        <w:t xml:space="preserve">Dirección (incluir el barrio/sector):       </w:t>
-      </w:r>
-      <w:r>
-        <w:rPr>
-          <w:rFonts w:ascii="Barlow" w:eastAsia="Barlow" w:hAnsi="Barlow" w:cs="Barlow"/>
-        </w:rPr>
-        <w:tab/>
-      </w:r>
-      <w:r>
-        <w:rPr>
-          <w:rFonts w:ascii="Barlow" w:eastAsia="Barlow" w:hAnsi="Barlow" w:cs="Barlow"/>
-          <w:sz w:val="22"/>
-          <w:szCs w:val="22"/>
-        </w:rPr>
-        <w:t>[[</w:t>
-      </w:r>
-      <w:proofErr w:type="spellStart"/>
-      <w:r>
-        <w:rPr>
-          <w:rFonts w:ascii="Barlow" w:eastAsia="Barlow" w:hAnsi="Barlow" w:cs="Barlow"/>
-          <w:sz w:val="22"/>
-          <w:szCs w:val="22"/>
-        </w:rPr>
-        <w:t>Direccion</w:t>
-      </w:r>
-      <w:proofErr w:type="spellEnd"/>
-      <w:r>
-        <w:rPr>
-          <w:rFonts w:ascii="Barlow" w:eastAsia="Barlow" w:hAnsi="Barlow" w:cs="Barlow"/>
-          <w:sz w:val="22"/>
-          <w:szCs w:val="22"/>
-        </w:rPr>
-        <w:t>]]</w:t>
-      </w:r>
-    </w:p>
-    <w:p>
-      <w:pPr>
-        <w:ind w:left="720"/>
-        <w:jc w:val="both"/>
-        <w:rPr>
-          <w:rFonts w:ascii="Barlow" w:eastAsia="Barlow" w:hAnsi="Barlow" w:cs="Barlow"/>
-        </w:rPr>
-      </w:pPr>
-    </w:p>
-    <w:p>
-      <w:pPr>
-        <w:ind w:firstLine="720"/>
-        <w:jc w:val="both"/>
-        <w:rPr>
-          <w:rFonts w:ascii="Barlow" w:eastAsia="Barlow" w:hAnsi="Barlow" w:cs="Barlow"/>
-          <w:sz w:val="22"/>
-          <w:szCs w:val="22"/>
-        </w:rPr>
-      </w:pPr>
-      <w:r>
-        <w:rPr>
-          <w:rFonts w:ascii="Barlow" w:eastAsia="Barlow" w:hAnsi="Barlow" w:cs="Barlow"/>
-        </w:rPr>
-        <w:t xml:space="preserve">Teléfono: </w:t>
-      </w:r>
-      <w:r>
-        <w:rPr>
-          <w:rFonts w:ascii="Barlow" w:eastAsia="Barlow" w:hAnsi="Barlow" w:cs="Barlow"/>
-        </w:rPr>
-        <w:tab/>
-      </w:r>
-      <w:r>
-        <w:rPr>
-          <w:rFonts w:ascii="Barlow" w:eastAsia="Barlow" w:hAnsi="Barlow" w:cs="Barlow"/>
-        </w:rPr>
-        <w:tab/>
-      </w:r>
-      <w:r>
-        <w:rPr>
-          <w:rFonts w:ascii="Barlow" w:eastAsia="Barlow" w:hAnsi="Barlow" w:cs="Barlow"/>
-        </w:rPr>
-        <w:tab/>
-      </w:r>
-      <w:r>
-        <w:rPr>
-          <w:rFonts w:ascii="Barlow" w:eastAsia="Barlow" w:hAnsi="Barlow" w:cs="Barlow"/>
-        </w:rPr>
-        <w:tab/>
-      </w:r>
-      <w:r>
-        <w:rPr>
-          <w:rFonts w:ascii="Barlow" w:eastAsia="Barlow" w:hAnsi="Barlow" w:cs="Barlow"/>
-          <w:sz w:val="22"/>
-          <w:szCs w:val="22"/>
-        </w:rPr>
-        <w:t>[[</w:t>
-      </w:r>
-      <w:proofErr w:type="spellStart"/>
-      <w:r>
-        <w:rPr>
-          <w:rFonts w:ascii="Barlow" w:eastAsia="Barlow" w:hAnsi="Barlow" w:cs="Barlow"/>
-          <w:sz w:val="22"/>
-          <w:szCs w:val="22"/>
-        </w:rPr>
-        <w:t>Telefono</w:t>
-      </w:r>
-      <w:proofErr w:type="spellEnd"/>
-      <w:r>
-        <w:rPr>
-          <w:rFonts w:ascii="Barlow" w:eastAsia="Barlow" w:hAnsi="Barlow" w:cs="Barlow"/>
-          <w:sz w:val="22"/>
-          <w:szCs w:val="22"/>
-        </w:rPr>
-        <w:t>]]</w:t>
-      </w:r>
-    </w:p>
-    <w:p>
-      <w:pPr>
-        <w:ind w:firstLine="720"/>
-        <w:jc w:val="both"/>
-        <w:rPr>
-          <w:rFonts w:ascii="Barlow" w:eastAsia="Barlow" w:hAnsi="Barlow" w:cs="Barlow"/>
-        </w:rPr>
-      </w:pPr>
-    </w:p>
-    <w:p>
-      <w:pPr>
-        <w:ind w:left="720"/>
-        <w:jc w:val="both"/>
-        <w:rPr>
-          <w:rFonts w:ascii="Barlow" w:eastAsia="Barlow" w:hAnsi="Barlow" w:cs="Barlow"/>
-        </w:rPr>
-      </w:pPr>
-      <w:r>
-        <w:rPr>
-          <w:rFonts w:ascii="Barlow" w:eastAsia="Barlow" w:hAnsi="Barlow" w:cs="Barlow"/>
-        </w:rPr>
-        <w:t xml:space="preserve">Correo Electrónico: </w:t>
       </w:r>
       <w:r>
         <w:rPr>
@@ -1967,8 +1978,9 @@
     </w:p>
     <w:p>
       <w:pPr>
-        <w:ind w:left="4260" w:hanging="4260"/>
-        <w:jc w:val="both"/>
+        <w:tabs>
+          <w:tab w:val="left" w:pos="0"/>
+        </w:tabs>
         <w:rPr>
           <w:rFonts w:ascii="Barlow" w:eastAsia="Barlow" w:hAnsi="Barlow" w:cs="Barlow"/>
           <w:sz w:val="22"/>
@@ -1991,9 +2003,8 @@
           <w:sz w:val="22"/>
           <w:szCs w:val="22"/>
         </w:rPr>
-        <w:t>:</w:t>
-      </w:r>
-      <w:proofErr w:type="gramStart"/>
+        <w:t xml:space="preserve">: </w:t>
+      </w:r>
       <w:r>
         <w:rPr>
           <w:rFonts w:ascii="Barlow" w:eastAsia="Barlow" w:hAnsi="Barlow" w:cs="Barlow"/>
@@ -2001,24 +2012,46 @@
           <w:szCs w:val="22"/>
         </w:rPr>
         <w:tab/>
-        <w:t xml:space="preserve">  </w:t>
-      </w:r>
-      <w:r>
-        <w:rPr>
-          <w:rFonts w:ascii="Barlow" w:eastAsia="Barlow" w:hAnsi="Barlow" w:cs="Barlow"/>
-          <w:sz w:val="22"/>
-          <w:szCs w:val="22"/>
-        </w:rPr>
-        <w:t>[</w:t>
-      </w:r>
-      <w:proofErr w:type="gramEnd"/>
-      <w:r>
-        <w:rPr>
-          <w:rFonts w:ascii="Barlow" w:eastAsia="Barlow" w:hAnsi="Barlow" w:cs="Barlow"/>
-          <w:sz w:val="22"/>
-          <w:szCs w:val="22"/>
-        </w:rPr>
-        <w:t xml:space="preserve">[Cargo]] </w:t>
+      </w:r>
+      <w:r>
+        <w:rPr>
+          <w:rFonts w:ascii="Barlow" w:eastAsia="Barlow" w:hAnsi="Barlow" w:cs="Barlow"/>
+          <w:sz w:val="22"/>
+          <w:szCs w:val="22"/>
+        </w:rPr>
+        <w:tab/>
+      </w:r>
+      <w:r>
+        <w:rPr>
+          <w:rFonts w:ascii="Barlow" w:eastAsia="Barlow" w:hAnsi="Barlow" w:cs="Barlow"/>
+          <w:sz w:val="22"/>
+          <w:szCs w:val="22"/>
+        </w:rPr>
+        <w:tab/>
+      </w:r>
+      <w:r>
+        <w:rPr>
+          <w:rFonts w:ascii="Barlow" w:eastAsia="Barlow" w:hAnsi="Barlow" w:cs="Barlow"/>
+          <w:sz w:val="22"/>
+          <w:szCs w:val="22"/>
+        </w:rPr>
+        <w:t>[[</w:t>
+      </w:r>
+      <w:r>
+        <w:rPr>
+          <w:rFonts w:ascii="Barlow" w:eastAsia="Barlow" w:hAnsi="Barlow" w:cs="Barlow"/>
+          <w:sz w:val="22"/>
+          <w:szCs w:val="22"/>
+        </w:rPr>
+        <w:t>Cargo</w:t>
+      </w:r>
+      <w:r>
+        <w:rPr>
+          <w:rFonts w:ascii="Barlow" w:eastAsia="Barlow" w:hAnsi="Barlow" w:cs="Barlow"/>
+          <w:sz w:val="22"/>
+          <w:szCs w:val="22"/>
+        </w:rPr>
+        <w:t>]]</w:t>
       </w:r>
     </w:p>
     <w:p>
@@ -2048,7 +2081,7 @@
           <w:sz w:val="22"/>
           <w:szCs w:val="22"/>
         </w:rPr>
-        <w:t>:</w:t>
+        <w:t xml:space="preserve">: </w:t>
       </w:r>
       <w:r>
         <w:rPr>
@@ -2088,14 +2121,6 @@
           <w:sz w:val="22"/>
           <w:szCs w:val="22"/>
         </w:rPr>
-        <w:t xml:space="preserve"> </w:t>
-      </w:r>
-      <w:r>
-        <w:rPr>
-          <w:rFonts w:ascii="Barlow" w:eastAsia="Barlow" w:hAnsi="Barlow" w:cs="Barlow"/>
-          <w:sz w:val="22"/>
-          <w:szCs w:val="22"/>
-        </w:rPr>
         <w:t>[[</w:t>
       </w:r>
       <w:proofErr w:type="spellStart"/>
@@ -2114,7 +2139,7 @@
           <w:sz w:val="22"/>
           <w:szCs w:val="22"/>
         </w:rPr>
-        <w:t xml:space="preserve">]] </w:t>
+        <w:t>]]</w:t>
       </w:r>
     </w:p>
     <w:p>
@@ -2143,14 +2168,18 @@
       <w:r>
         <w:rPr>
           <w:rFonts w:ascii="Barlow" w:eastAsia="Barlow" w:hAnsi="Barlow" w:cs="Barlow"/>
-          <w:sz w:val="22"/>
-          <w:szCs w:val="22"/>
-        </w:rPr>
-        <w:t>:</w:t>
-      </w:r>
-      <w:r>
-        <w:rPr>
-          <w:rFonts w:ascii="Barlow" w:eastAsia="Barlow" w:hAnsi="Barlow" w:cs="Barlow"/>
+          <w:b/>
+          <w:bCs/>
+          <w:sz w:val="22"/>
+          <w:szCs w:val="22"/>
+        </w:rPr>
+        <w:t xml:space="preserve">: </w:t>
+      </w:r>
+      <w:r>
+        <w:rPr>
+          <w:rFonts w:ascii="Barlow" w:eastAsia="Barlow" w:hAnsi="Barlow" w:cs="Barlow"/>
+          <w:b/>
+          <w:bCs/>
           <w:sz w:val="22"/>
           <w:szCs w:val="22"/>
         </w:rPr>
@@ -2162,7 +2191,7 @@
           <w:sz w:val="22"/>
           <w:szCs w:val="22"/>
         </w:rPr>
-        <w:t xml:space="preserve">[[Salario]] </w:t>
+        <w:t>[[Salario]]</w:t>
       </w:r>
     </w:p>
     <w:p>
@@ -2222,7 +2251,50 @@
           <w:sz w:val="22"/>
           <w:szCs w:val="22"/>
         </w:rPr>
-        <w:t xml:space="preserve">La anterior se expide en Ciudad de Bogotá el </w:t>
+        <w:t xml:space="preserve">La anterior se expide en </w:t>
+      </w:r>
+      <w:r>
+        <w:rPr>
+          <w:rFonts w:ascii="Barlow" w:eastAsia="Barlow" w:hAnsi="Barlow" w:cs="Barlow"/>
+          <w:sz w:val="22"/>
+          <w:szCs w:val="22"/>
+        </w:rPr>
+        <w:t>[[</w:t>
+      </w:r>
+      <w:proofErr w:type="spellStart"/>
+      <w:r>
+        <w:rPr>
+          <w:rFonts w:ascii="Barlow" w:eastAsia="Barlow" w:hAnsi="Barlow" w:cs="Barlow"/>
+          <w:sz w:val="22"/>
+          <w:szCs w:val="22"/>
+        </w:rPr>
+        <w:t>CiudadWork</w:t>
+      </w:r>
+      <w:proofErr w:type="spellEnd"/>
+      <w:r>
+        <w:rPr>
+          <w:rFonts w:ascii="Barlow" w:eastAsia="Barlow" w:hAnsi="Barlow" w:cs="Barlow"/>
+          <w:sz w:val="22"/>
+          <w:szCs w:val="22"/>
+        </w:rPr>
+        <w:t>]]</w:t>
+      </w:r>
+      <w:r>
+        <w:rPr>
+          <w:rFonts w:ascii="Barlow" w:eastAsia="Barlow" w:hAnsi="Barlow" w:cs="Barlow"/>
+          <w:sz w:val="22"/>
+          <w:szCs w:val="22"/>
+        </w:rPr>
+        <w:t xml:space="preserve"> </w:t>
+      </w:r>
+      <w:r>
+        <w:rPr>
+          <w:rFonts w:ascii="Barlow" w:eastAsia="Barlow" w:hAnsi="Barlow" w:cs="Barlow"/>
+          <w:color w:val="000000"/>
+          <w:sz w:val="22"/>
+          <w:szCs w:val="22"/>
+        </w:rPr>
+        <w:t xml:space="preserve">el </w:t>
       </w:r>
       <w:r>
         <w:rPr>

</xml_diff>